<commit_message>
feat(mdm): import CSV aligné sur schéma SQL + guide de démarrage v1.1
- Articles : 6 champs manquants ajoutés au mapper CSV (coeffConversion,
  uniteAchat, coeffConversionAchat, volumeUnitaire, pointCommande, codeBarres)
  + importArticleRows mis à jour pour passer ces champs à createArticle
- Fournisseurs : ajout scoreFilabilite dans le mapper CSV
- Clients, Fournisseurs, Articles : accept "Oui"/"Non" en plus de "true"/"false"
  pour les champs booléens (gestionLot, paiementMobile)
- Bluwa_Templates_Import.xlsx : template client aligné sur le schéma SQL
  (Articles 21 col., Fournisseurs 14 col., Clients 17 col.)
- Guide de démarrage v1.1 : Étape 6 ajoutée (saisie manuelle + import CSV),
  "Prochaines étapes" mis à jour, footer corrigé (app.bluwa.com)

Co-Authored-By: Claude Sonnet 4.6 <noreply@anthropic.com>
</commit_message>
<xml_diff>
--- a/docs/Bluwa_Guide_Demarrage.docx
+++ b/docs/Bluwa_Guide_Demarrage.docx
@@ -282,30 +282,7 @@
           <w:rFonts w:ascii="Baskerville" w:hAnsi="Baskerville"/>
           <w:color w:val="000000" w:themeColor="text1"/>
         </w:rPr>
-        <w:t xml:space="preserve">Une adresse </w:t>
-      </w:r>
-      <w:proofErr w:type="gramStart"/>
-      <w:r>
-        <w:rPr>
-          <w:rFonts w:ascii="Baskerville" w:hAnsi="Baskerville"/>
-          <w:color w:val="000000" w:themeColor="text1"/>
-        </w:rPr>
-        <w:t>e</w:t>
-      </w:r>
-      <w:r>
-        <w:rPr>
-          <w:rFonts w:ascii="Baskerville" w:hAnsi="Baskerville"/>
-          <w:color w:val="000000" w:themeColor="text1"/>
-        </w:rPr>
-        <w:t>mail</w:t>
-      </w:r>
-      <w:proofErr w:type="gramEnd"/>
-      <w:r>
-        <w:rPr>
-          <w:rFonts w:ascii="Baskerville" w:hAnsi="Baskerville"/>
-          <w:color w:val="000000" w:themeColor="text1"/>
-        </w:rPr>
-        <w:t xml:space="preserve"> valide ou un compte Google</w:t>
+        <w:t>Une adresse email valide ou un compte Google</w:t>
       </w:r>
     </w:p>
     <w:p>
@@ -348,7 +325,6 @@
           <w:color w:val="000000" w:themeColor="text1"/>
         </w:rPr>
       </w:pPr>
-      <w:proofErr w:type="gramStart"/>
       <w:r>
         <w:rPr>
           <w:rFonts w:ascii="Apple Color Emoji" w:hAnsi="Apple Color Emoji" w:cs="Apple Color Emoji"/>
@@ -358,7 +334,6 @@
         </w:rPr>
         <w:t>ℹ️</w:t>
       </w:r>
-      <w:proofErr w:type="gramEnd"/>
       <w:r>
         <w:rPr>
           <w:rFonts w:ascii="Baskerville" w:hAnsi="Baskerville"/>
@@ -543,17 +518,8 @@
           <w:rFonts w:ascii="Baskerville" w:hAnsi="Baskerville"/>
           <w:color w:val="000000" w:themeColor="text1"/>
         </w:rPr>
-        <w:t xml:space="preserve">Option B — Via </w:t>
-      </w:r>
-      <w:proofErr w:type="gramStart"/>
-      <w:r>
-        <w:rPr>
-          <w:rFonts w:ascii="Baskerville" w:hAnsi="Baskerville"/>
-          <w:color w:val="000000" w:themeColor="text1"/>
-        </w:rPr>
-        <w:t>email</w:t>
-      </w:r>
-      <w:proofErr w:type="gramEnd"/>
+        <w:t>Option B — Via Email</w:t>
+      </w:r>
     </w:p>
     <w:p>
       <w:pPr>
@@ -594,23 +560,7 @@
           <w:rFonts w:ascii="Baskerville" w:hAnsi="Baskerville"/>
           <w:color w:val="000000" w:themeColor="text1"/>
         </w:rPr>
-        <w:t xml:space="preserve">Entrez votre adresse </w:t>
-      </w:r>
-      <w:proofErr w:type="gramStart"/>
-      <w:r>
-        <w:rPr>
-          <w:rFonts w:ascii="Baskerville" w:hAnsi="Baskerville"/>
-          <w:color w:val="000000" w:themeColor="text1"/>
-        </w:rPr>
-        <w:t>email</w:t>
-      </w:r>
-      <w:proofErr w:type="gramEnd"/>
-      <w:r>
-        <w:rPr>
-          <w:rFonts w:ascii="Baskerville" w:hAnsi="Baskerville"/>
-          <w:color w:val="000000" w:themeColor="text1"/>
-        </w:rPr>
-        <w:t xml:space="preserve"> professionnelle</w:t>
+        <w:t>Entrez votre adresse Email professionnelle</w:t>
       </w:r>
     </w:p>
     <w:p>
@@ -743,7 +693,7 @@
           <w:sz w:val="18"/>
           <w:szCs w:val="18"/>
         </w:rPr>
-        <w:t>Fig. 1 — Page de création de compte</w:t>
+        <w:t>Fig. 1 - Page de création de compte</w:t>
       </w:r>
     </w:p>
     <w:p>
@@ -756,7 +706,6 @@
           <w:color w:val="000000" w:themeColor="text1"/>
         </w:rPr>
       </w:pPr>
-      <w:proofErr w:type="gramStart"/>
       <w:r>
         <w:rPr>
           <w:rFonts w:ascii="Apple Color Emoji" w:hAnsi="Apple Color Emoji" w:cs="Apple Color Emoji"/>
@@ -784,19 +733,7 @@
           <w:sz w:val="20"/>
           <w:szCs w:val="20"/>
         </w:rPr>
-        <w:t>Si</w:t>
-      </w:r>
-      <w:proofErr w:type="gramEnd"/>
-      <w:r>
-        <w:rPr>
-          <w:rFonts w:ascii="Baskerville" w:hAnsi="Baskerville"/>
-          <w:i/>
-          <w:iCs/>
-          <w:color w:val="000000" w:themeColor="text1"/>
-          <w:sz w:val="20"/>
-          <w:szCs w:val="20"/>
-        </w:rPr>
-        <w:t xml:space="preserve"> vous avez déjà un compte, cliquez sur « Se connecter » en bas de la page.</w:t>
+        <w:t>Si vous avez déjà un compte, cliquez sur « Se connecter » en bas de la page.</w:t>
       </w:r>
     </w:p>
     <w:p>
@@ -888,23 +825,7 @@
           <w:rFonts w:ascii="Baskerville" w:hAnsi="Baskerville"/>
           <w:color w:val="000000" w:themeColor="text1"/>
         </w:rPr>
-        <w:t xml:space="preserve">Entrez votre adresse </w:t>
-      </w:r>
-      <w:proofErr w:type="gramStart"/>
-      <w:r>
-        <w:rPr>
-          <w:rFonts w:ascii="Baskerville" w:hAnsi="Baskerville"/>
-          <w:color w:val="000000" w:themeColor="text1"/>
-        </w:rPr>
-        <w:t>email</w:t>
-      </w:r>
-      <w:proofErr w:type="gramEnd"/>
-      <w:r>
-        <w:rPr>
-          <w:rFonts w:ascii="Baskerville" w:hAnsi="Baskerville"/>
-          <w:color w:val="000000" w:themeColor="text1"/>
-        </w:rPr>
-        <w:t xml:space="preserve"> et votre mot de passe</w:t>
+        <w:t>Entrez votre adresse Email et votre mot de passe</w:t>
       </w:r>
     </w:p>
     <w:p>
@@ -1050,7 +971,6 @@
           <w:color w:val="000000" w:themeColor="text1"/>
         </w:rPr>
       </w:pPr>
-      <w:proofErr w:type="gramStart"/>
       <w:r>
         <w:rPr>
           <w:rFonts w:ascii="Apple Color Emoji" w:hAnsi="Apple Color Emoji" w:cs="Apple Color Emoji"/>
@@ -1078,19 +998,7 @@
           <w:sz w:val="20"/>
           <w:szCs w:val="20"/>
         </w:rPr>
-        <w:t>En</w:t>
-      </w:r>
-      <w:proofErr w:type="gramEnd"/>
-      <w:r>
-        <w:rPr>
-          <w:rFonts w:ascii="Baskerville" w:hAnsi="Baskerville"/>
-          <w:i/>
-          <w:iCs/>
-          <w:color w:val="000000" w:themeColor="text1"/>
-          <w:sz w:val="20"/>
-          <w:szCs w:val="20"/>
-        </w:rPr>
-        <w:t xml:space="preserve"> cas d’oubli de mot de passe, contactez votre administrateur Bluwa.</w:t>
+        <w:t>En cas d’oubli de mot de passe, contactez votre administrateur Bluwa.</w:t>
       </w:r>
     </w:p>
     <w:p>
@@ -1237,23 +1145,7 @@
           <w:rFonts w:ascii="Baskerville" w:hAnsi="Baskerville"/>
           <w:color w:val="000000" w:themeColor="text1"/>
         </w:rPr>
-        <w:t>Exemple : « Chom Factory », « </w:t>
-      </w:r>
-      <w:proofErr w:type="spellStart"/>
-      <w:r>
-        <w:rPr>
-          <w:rFonts w:ascii="Baskerville" w:hAnsi="Baskerville"/>
-          <w:color w:val="000000" w:themeColor="text1"/>
-        </w:rPr>
-        <w:t>Africube</w:t>
-      </w:r>
-      <w:proofErr w:type="spellEnd"/>
-      <w:r>
-        <w:rPr>
-          <w:rFonts w:ascii="Baskerville" w:hAnsi="Baskerville"/>
-          <w:color w:val="000000" w:themeColor="text1"/>
-        </w:rPr>
-        <w:t> »</w:t>
+        <w:t>Exemple : « Chom Factory », « Africube »</w:t>
       </w:r>
     </w:p>
     <w:p>
@@ -1663,7 +1555,6 @@
           <w:color w:val="000000" w:themeColor="text1"/>
         </w:rPr>
       </w:pPr>
-      <w:proofErr w:type="gramStart"/>
       <w:r>
         <w:rPr>
           <w:rFonts w:ascii="Apple Color Emoji" w:hAnsi="Apple Color Emoji" w:cs="Apple Color Emoji"/>
@@ -1673,7 +1564,6 @@
         </w:rPr>
         <w:t>ℹ️</w:t>
       </w:r>
-      <w:proofErr w:type="gramEnd"/>
       <w:r>
         <w:rPr>
           <w:rFonts w:ascii="Baskerville" w:hAnsi="Baskerville"/>
@@ -2041,7 +1931,6 @@
           <w:color w:val="000000" w:themeColor="text1"/>
         </w:rPr>
       </w:pPr>
-      <w:proofErr w:type="gramStart"/>
       <w:r>
         <w:rPr>
           <w:rFonts w:ascii="Apple Color Emoji" w:hAnsi="Apple Color Emoji" w:cs="Apple Color Emoji"/>
@@ -2069,19 +1958,7 @@
           <w:sz w:val="20"/>
           <w:szCs w:val="20"/>
         </w:rPr>
-        <w:t>Les</w:t>
-      </w:r>
-      <w:proofErr w:type="gramEnd"/>
-      <w:r>
-        <w:rPr>
-          <w:rFonts w:ascii="Baskerville" w:hAnsi="Baskerville"/>
-          <w:i/>
-          <w:iCs/>
-          <w:color w:val="000000" w:themeColor="text1"/>
-          <w:sz w:val="20"/>
-          <w:szCs w:val="20"/>
-        </w:rPr>
-        <w:t xml:space="preserve"> données affichées au premier lancement sont des exemples. Elles seront remplacées par vos propres données au fur et à mesure de l’utilisation.</w:t>
+        <w:t>Les données affichées au premier lancement sont des exemples. Elles seront remplacées par vos propres données au fur et à mesure de l’utilisation.</w:t>
       </w:r>
     </w:p>
     <w:p>
@@ -2132,7 +2009,7 @@
           <w:rFonts w:ascii="Baskerville" w:hAnsi="Baskerville"/>
           <w:color w:val="000000" w:themeColor="text1"/>
         </w:rPr>
-        <w:t>Maintenant que votre espace est créé, voici les actions recommandées dans l’ordre :</w:t>
+        <w:t>Maintenant que votre espace est créé, voici les prochaines étapes dans l’ordre :</w:t>
       </w:r>
     </w:p>
     <w:p>
@@ -2162,7 +2039,7 @@
           <w:rFonts w:ascii="Baskerville" w:hAnsi="Baskerville"/>
           <w:color w:val="000000" w:themeColor="text1"/>
         </w:rPr>
-        <w:t>Paramétrer vos articles et unités de mesure (menu « Articles »)</w:t>
+        <w:t>Renseigner vos articles, fournisseurs et clients (voir Étape 6 ci-après)</w:t>
       </w:r>
     </w:p>
     <w:p>
@@ -2183,7 +2060,7 @@
           <w:rFonts w:ascii="Baskerville" w:hAnsi="Baskerville"/>
           <w:color w:val="000000" w:themeColor="text1"/>
         </w:rPr>
-        <w:t>Ajouter vos fournisseurs (menu « Fournisseurs »)</w:t>
+        <w:t>Enregistrer votre première réception de matières premières</w:t>
       </w:r>
     </w:p>
     <w:p>
@@ -2204,7 +2081,163 @@
           <w:rFonts w:ascii="Baskerville" w:hAnsi="Baskerville"/>
           <w:color w:val="000000" w:themeColor="text1"/>
         </w:rPr>
-        <w:t>Enregistrer votre première réception de matières premières</w:t>
+        <w:t>Lancer votre premier ordre de fabrication</w:t>
+      </w:r>
+    </w:p>
+    <w:p>
+      <w:pPr>
+        <w:spacing w:before="280"/>
+        <w:rPr>
+          <w:rFonts w:ascii="Baskerville" w:hAnsi="Baskerville"/>
+          <w:color w:val="000000" w:themeColor="text1"/>
+        </w:rPr>
+      </w:pPr>
+    </w:p>
+    <w:p>
+      <w:pPr>
+        <w:shd w:val="clear" w:color="auto" w:fill="EEF4FF"/>
+        <w:spacing w:before="80" w:after="160"/>
+        <w:ind w:left="280" w:right="280"/>
+        <w:rPr>
+          <w:rFonts w:ascii="Baskerville" w:hAnsi="Baskerville"/>
+          <w:color w:val="000000" w:themeColor="text1"/>
+        </w:rPr>
+      </w:pPr>
+      <w:r>
+        <w:rPr>
+          <w:rFonts w:ascii="Apple Color Emoji" w:hAnsi="Apple Color Emoji" w:cs="Apple Color Emoji"/>
+          <w:color w:val="000000" w:themeColor="text1"/>
+          <w:sz w:val="20"/>
+          <w:szCs w:val="20"/>
+        </w:rPr>
+        <w:t>ℹ️</w:t>
+      </w:r>
+      <w:r>
+        <w:rPr>
+          <w:rFonts w:ascii="Baskerville" w:hAnsi="Baskerville"/>
+          <w:color w:val="000000" w:themeColor="text1"/>
+          <w:sz w:val="20"/>
+          <w:szCs w:val="20"/>
+        </w:rPr>
+        <w:t xml:space="preserve">  </w:t>
+      </w:r>
+      <w:r>
+        <w:rPr>
+          <w:rFonts w:ascii="Baskerville" w:hAnsi="Baskerville"/>
+          <w:i/>
+          <w:iCs/>
+          <w:color w:val="000000" w:themeColor="text1"/>
+          <w:sz w:val="20"/>
+          <w:szCs w:val="20"/>
+        </w:rPr>
+        <w:t>Pour toute question, contactez votre interlocuteur Bluwa.</w:t>
+      </w:r>
+    </w:p>
+    <w:p>
+      <w:pPr>
+        <w:spacing w:before="0" w:after="0"/>
+        <w:rPr>
+          <w:rFonts w:ascii="Baskerville" w:hAnsi="Baskerville"/>
+          <w:color w:val="000000" w:themeColor="text1"/>
+        </w:rPr>
+      </w:pPr>
+      <w:r>
+        <w:rPr>
+          <w:rFonts w:ascii="Baskerville" w:hAnsi="Baskerville"/>
+          <w:color w:val="000000" w:themeColor="text1"/>
+        </w:rPr>
+        <w:br w:type="page"/>
+      </w:r>
+    </w:p>
+    <w:p>
+      <w:pPr>
+        <w:spacing w:before="320" w:after="100"/>
+        <w:rPr>
+          <w:rFonts w:ascii="Baskerville" w:hAnsi="Baskerville"/>
+          <w:color w:val="000000" w:themeColor="text1"/>
+        </w:rPr>
+      </w:pPr>
+      <w:r>
+        <w:rPr>
+          <w:rFonts w:ascii="Baskerville" w:hAnsi="Baskerville"/>
+          <w:b/>
+          <w:bCs/>
+          <w:color w:val="000000" w:themeColor="text1"/>
+          <w:sz w:val="18"/>
+          <w:szCs w:val="18"/>
+        </w:rPr>
+        <w:t>Étape 6 sur 6</w:t>
+      </w:r>
+    </w:p>
+    <w:p>
+      <w:pPr>
+        <w:pStyle w:val="Titre1"/>
+        <w:pBdr>
+          <w:bottom w:val="single" w:sz="4" w:space="6" w:color="1B4BFF"/>
+        </w:pBdr>
+        <w:rPr>
+          <w:rFonts w:ascii="Baskerville" w:hAnsi="Baskerville"/>
+          <w:color w:val="000000" w:themeColor="text1"/>
+        </w:rPr>
+      </w:pPr>
+      <w:r>
+        <w:rPr>
+          <w:rFonts w:ascii="Baskerville" w:hAnsi="Baskerville"/>
+          <w:color w:val="000000" w:themeColor="text1"/>
+        </w:rPr>
+        <w:t>Renseigner vos données de référence</w:t>
+      </w:r>
+    </w:p>
+    <w:p>
+      <w:pPr>
+        <w:spacing w:after="120"/>
+        <w:rPr>
+          <w:rFonts w:ascii="Baskerville" w:hAnsi="Baskerville"/>
+          <w:color w:val="000000" w:themeColor="text1"/>
+        </w:rPr>
+      </w:pPr>
+      <w:r>
+        <w:rPr>
+          <w:rFonts w:ascii="Baskerville" w:hAnsi="Baskerville"/>
+          <w:color w:val="000000" w:themeColor="text1"/>
+        </w:rPr>
+        <w:t>Avant de pouvoir enregistrer une réception, lancer un ordre de fabrication ou créer une vente, vous devez renseigner vos données de base : articles, fournisseurs et clients. Deux méthodes sont disponibles selon votre situation.</w:t>
+      </w:r>
+    </w:p>
+    <w:p>
+      <w:pPr>
+        <w:spacing w:before="280" w:after="80"/>
+        <w:rPr>
+          <w:rFonts w:ascii="Baskerville" w:hAnsi="Baskerville"/>
+          <w:b/>
+          <w:bCs/>
+          <w:color w:val="000000" w:themeColor="text1"/>
+        </w:rPr>
+      </w:pPr>
+      <w:r>
+        <w:rPr>
+          <w:rFonts w:ascii="Baskerville" w:hAnsi="Baskerville"/>
+          <w:b/>
+          <w:bCs/>
+          <w:color w:val="000000" w:themeColor="text1"/>
+        </w:rPr>
+        <w:t>Méthode A — Saisie manuelle (recommandée pour démarrer)</w:t>
+      </w:r>
+    </w:p>
+    <w:p>
+      <w:pPr>
+        <w:spacing w:after="80"/>
+        <w:rPr>
+          <w:rFonts w:ascii="Baskerville" w:hAnsi="Baskerville"/>
+          <w:color w:val="000000" w:themeColor="text1"/>
+        </w:rPr>
+      </w:pPr>
+      <w:r>
+        <w:rPr>
+          <w:rFonts w:ascii="Baskerville" w:hAnsi="Baskerville"/>
+          <w:color w:val="000000" w:themeColor="text1"/>
+        </w:rPr>
+        <w:t>Depuis la barre latérale, allez dans le module souhaité (« Articles », « Fournisseurs » ou « Clients »), puis :</w:t>
       </w:r>
     </w:p>
     <w:p>
@@ -2214,6 +2247,104 @@
           <w:ilvl w:val="0"/>
           <w:numId w:val="2"/>
         </w:numPr>
+        <w:spacing w:after="60"/>
+        <w:rPr>
+          <w:rFonts w:ascii="Baskerville" w:hAnsi="Baskerville"/>
+          <w:color w:val="000000" w:themeColor="text1"/>
+        </w:rPr>
+      </w:pPr>
+      <w:r>
+        <w:rPr>
+          <w:rFonts w:ascii="Baskerville" w:hAnsi="Baskerville"/>
+          <w:color w:val="000000" w:themeColor="text1"/>
+        </w:rPr>
+        <w:t>Cliquez sur « + Ajouter »</w:t>
+      </w:r>
+    </w:p>
+    <w:p>
+      <w:pPr>
+        <w:pStyle w:val="Paragraphedeliste"/>
+        <w:numPr>
+          <w:ilvl w:val="0"/>
+          <w:numId w:val="2"/>
+        </w:numPr>
+        <w:spacing w:after="60"/>
+        <w:rPr>
+          <w:rFonts w:ascii="Baskerville" w:hAnsi="Baskerville"/>
+          <w:color w:val="000000" w:themeColor="text1"/>
+        </w:rPr>
+      </w:pPr>
+      <w:r>
+        <w:rPr>
+          <w:rFonts w:ascii="Baskerville" w:hAnsi="Baskerville"/>
+          <w:color w:val="000000" w:themeColor="text1"/>
+        </w:rPr>
+        <w:t>Remplissez le formulaire (seuls les champs marqués * sont obligatoires)</w:t>
+      </w:r>
+    </w:p>
+    <w:p>
+      <w:pPr>
+        <w:pStyle w:val="Paragraphedeliste"/>
+        <w:numPr>
+          <w:ilvl w:val="0"/>
+          <w:numId w:val="2"/>
+        </w:numPr>
+        <w:spacing w:after="120"/>
+        <w:rPr>
+          <w:rFonts w:ascii="Baskerville" w:hAnsi="Baskerville"/>
+          <w:color w:val="000000" w:themeColor="text1"/>
+        </w:rPr>
+      </w:pPr>
+      <w:r>
+        <w:rPr>
+          <w:rFonts w:ascii="Baskerville" w:hAnsi="Baskerville"/>
+          <w:color w:val="000000" w:themeColor="text1"/>
+        </w:rPr>
+        <w:t>Cliquez sur « Enregistrer »</w:t>
+      </w:r>
+    </w:p>
+    <w:p>
+      <w:pPr>
+        <w:spacing w:after="200"/>
+        <w:rPr>
+          <w:rFonts w:ascii="Baskerville" w:hAnsi="Baskerville"/>
+          <w:i/>
+          <w:iCs/>
+          <w:color w:val="000000" w:themeColor="text1"/>
+        </w:rPr>
+      </w:pPr>
+      <w:r>
+        <w:rPr>
+          <w:rFonts w:ascii="Baskerville" w:hAnsi="Baskerville"/>
+          <w:i/>
+          <w:iCs/>
+          <w:color w:val="000000" w:themeColor="text1"/>
+        </w:rPr>
+        <w:t>Recommandée si vous avez peu d’articles ou souhaitez démarrer progressivement.</w:t>
+      </w:r>
+    </w:p>
+    <w:p>
+      <w:pPr>
+        <w:spacing w:before="280" w:after="80"/>
+        <w:rPr>
+          <w:rFonts w:ascii="Baskerville" w:hAnsi="Baskerville"/>
+          <w:b/>
+          <w:bCs/>
+          <w:color w:val="000000" w:themeColor="text1"/>
+        </w:rPr>
+      </w:pPr>
+      <w:r>
+        <w:rPr>
+          <w:rFonts w:ascii="Baskerville" w:hAnsi="Baskerville"/>
+          <w:b/>
+          <w:bCs/>
+          <w:color w:val="000000" w:themeColor="text1"/>
+        </w:rPr>
+        <w:t>Méthode B — Import en masse via le fichier template</w:t>
+      </w:r>
+    </w:p>
+    <w:p>
+      <w:pPr>
         <w:spacing w:after="80"/>
         <w:rPr>
           <w:rFonts w:ascii="Baskerville" w:hAnsi="Baskerville"/>
@@ -2225,29 +2356,140 @@
           <w:rFonts w:ascii="Baskerville" w:hAnsi="Baskerville"/>
           <w:color w:val="000000" w:themeColor="text1"/>
         </w:rPr>
-        <w:t>Lancer votre premier ordre de fabrication</w:t>
-      </w:r>
-    </w:p>
-    <w:p>
-      <w:pPr>
-        <w:spacing w:before="280"/>
-        <w:rPr>
-          <w:rFonts w:ascii="Baskerville" w:hAnsi="Baskerville"/>
-          <w:color w:val="000000" w:themeColor="text1"/>
-        </w:rPr>
-      </w:pPr>
+        <w:t xml:space="preserve">Si vous avez un catalogue existant, utilisez le fichier </w:t>
+      </w:r>
+      <w:r>
+        <w:rPr>
+          <w:rFonts w:ascii="Baskerville" w:hAnsi="Baskerville"/>
+          <w:b/>
+          <w:bCs/>
+          <w:color w:val="000000" w:themeColor="text1"/>
+        </w:rPr>
+        <w:t>Bluwa_Templates_Import.xlsx</w:t>
+      </w:r>
+      <w:r>
+        <w:rPr>
+          <w:rFonts w:ascii="Baskerville" w:hAnsi="Baskerville"/>
+          <w:color w:val="000000" w:themeColor="text1"/>
+        </w:rPr>
+        <w:t xml:space="preserve"> fourni par votre chargé de déploiement. Remplissez les onglets concernés (Articles, Fournisseurs, Clients), enregistrez en CSV, puis :</w:t>
+      </w:r>
+    </w:p>
+    <w:p>
+      <w:pPr>
+        <w:pStyle w:val="Paragraphedeliste"/>
+        <w:numPr>
+          <w:ilvl w:val="0"/>
+          <w:numId w:val="2"/>
+        </w:numPr>
+        <w:spacing w:after="60"/>
+        <w:rPr>
+          <w:rFonts w:ascii="Baskerville" w:hAnsi="Baskerville"/>
+          <w:color w:val="000000" w:themeColor="text1"/>
+        </w:rPr>
+      </w:pPr>
+      <w:r>
+        <w:rPr>
+          <w:rFonts w:ascii="Baskerville" w:hAnsi="Baskerville"/>
+          <w:color w:val="000000" w:themeColor="text1"/>
+        </w:rPr>
+        <w:t>Dans l’application, allez dans le module souhaité (Articles, Fournisseurs ou Clients)</w:t>
+      </w:r>
+    </w:p>
+    <w:p>
+      <w:pPr>
+        <w:pStyle w:val="Paragraphedeliste"/>
+        <w:numPr>
+          <w:ilvl w:val="0"/>
+          <w:numId w:val="2"/>
+        </w:numPr>
+        <w:spacing w:after="60"/>
+        <w:rPr>
+          <w:rFonts w:ascii="Baskerville" w:hAnsi="Baskerville"/>
+          <w:color w:val="000000" w:themeColor="text1"/>
+        </w:rPr>
+      </w:pPr>
+      <w:r>
+        <w:rPr>
+          <w:rFonts w:ascii="Baskerville" w:hAnsi="Baskerville"/>
+          <w:color w:val="000000" w:themeColor="text1"/>
+        </w:rPr>
+        <w:t>Cliquez sur l’icône « Importer » en haut à droite</w:t>
+      </w:r>
+    </w:p>
+    <w:p>
+      <w:pPr>
+        <w:pStyle w:val="Paragraphedeliste"/>
+        <w:numPr>
+          <w:ilvl w:val="0"/>
+          <w:numId w:val="2"/>
+        </w:numPr>
+        <w:spacing w:after="60"/>
+        <w:rPr>
+          <w:rFonts w:ascii="Baskerville" w:hAnsi="Baskerville"/>
+          <w:color w:val="000000" w:themeColor="text1"/>
+        </w:rPr>
+      </w:pPr>
+      <w:r>
+        <w:rPr>
+          <w:rFonts w:ascii="Baskerville" w:hAnsi="Baskerville"/>
+          <w:color w:val="000000" w:themeColor="text1"/>
+        </w:rPr>
+        <w:t>Sélectionnez votre fichier CSV</w:t>
+      </w:r>
+    </w:p>
+    <w:p>
+      <w:pPr>
+        <w:pStyle w:val="Paragraphedeliste"/>
+        <w:numPr>
+          <w:ilvl w:val="0"/>
+          <w:numId w:val="2"/>
+        </w:numPr>
+        <w:spacing w:after="60"/>
+        <w:rPr>
+          <w:rFonts w:ascii="Baskerville" w:hAnsi="Baskerville"/>
+          <w:color w:val="000000" w:themeColor="text1"/>
+        </w:rPr>
+      </w:pPr>
+      <w:r>
+        <w:rPr>
+          <w:rFonts w:ascii="Baskerville" w:hAnsi="Baskerville"/>
+          <w:color w:val="000000" w:themeColor="text1"/>
+        </w:rPr>
+        <w:t>Vérifiez le mapping des colonnes — Bluwa associe automatiquement les colonnes connues</w:t>
+      </w:r>
+    </w:p>
+    <w:p>
+      <w:pPr>
+        <w:pStyle w:val="Paragraphedeliste"/>
+        <w:numPr>
+          <w:ilvl w:val="0"/>
+          <w:numId w:val="2"/>
+        </w:numPr>
+        <w:spacing w:after="160"/>
+        <w:rPr>
+          <w:rFonts w:ascii="Baskerville" w:hAnsi="Baskerville"/>
+          <w:color w:val="000000" w:themeColor="text1"/>
+        </w:rPr>
+      </w:pPr>
+      <w:r>
+        <w:rPr>
+          <w:rFonts w:ascii="Baskerville" w:hAnsi="Baskerville"/>
+          <w:color w:val="000000" w:themeColor="text1"/>
+        </w:rPr>
+        <w:t>Cliquez sur « Importer X lignes » pour confirmer</w:t>
+      </w:r>
     </w:p>
     <w:p>
       <w:pPr>
         <w:shd w:val="clear" w:color="auto" w:fill="EEF4FF"/>
-        <w:spacing w:before="80" w:after="160"/>
+        <w:spacing w:before="80" w:after="280"/>
         <w:ind w:left="280" w:right="280"/>
         <w:rPr>
           <w:rFonts w:ascii="Baskerville" w:hAnsi="Baskerville"/>
           <w:color w:val="000000" w:themeColor="text1"/>
         </w:rPr>
       </w:pPr>
-      <w:proofErr w:type="gramStart"/>
       <w:r>
         <w:rPr>
           <w:rFonts w:ascii="Apple Color Emoji" w:hAnsi="Apple Color Emoji" w:cs="Apple Color Emoji"/>
@@ -2275,19 +2517,7 @@
           <w:sz w:val="20"/>
           <w:szCs w:val="20"/>
         </w:rPr>
-        <w:t>Pour</w:t>
-      </w:r>
-      <w:proofErr w:type="gramEnd"/>
-      <w:r>
-        <w:rPr>
-          <w:rFonts w:ascii="Baskerville" w:hAnsi="Baskerville"/>
-          <w:i/>
-          <w:iCs/>
-          <w:color w:val="000000" w:themeColor="text1"/>
-          <w:sz w:val="20"/>
-          <w:szCs w:val="20"/>
-        </w:rPr>
-        <w:t xml:space="preserve"> toute question, contactez votre interlocuteur Bluwa. Un guide détaillé par module sera disponible prochainement.</w:t>
+        <w:t>Les codes articles, fournisseurs et clients sont générés automatiquement si vous laissez la colonne vide. Vous pouvez les modifier depuis l’application à tout moment.</w:t>
       </w:r>
     </w:p>
     <w:p>
@@ -2311,8 +2541,6 @@
           <w:color w:val="000000" w:themeColor="text1"/>
         </w:rPr>
       </w:pPr>
-      <w:proofErr w:type="spellStart"/>
-      <w:proofErr w:type="gramStart"/>
       <w:r>
         <w:rPr>
           <w:rFonts w:ascii="Baskerville" w:hAnsi="Baskerville"/>
@@ -2320,47 +2548,7 @@
           <w:sz w:val="18"/>
           <w:szCs w:val="18"/>
         </w:rPr>
-        <w:t>bluwa.vercel.app</w:t>
-      </w:r>
-      <w:proofErr w:type="spellEnd"/>
-      <w:r>
-        <w:rPr>
-          <w:rFonts w:ascii="Baskerville" w:hAnsi="Baskerville"/>
-          <w:color w:val="000000" w:themeColor="text1"/>
-          <w:sz w:val="18"/>
-          <w:szCs w:val="18"/>
-        </w:rPr>
-        <w:t xml:space="preserve">  ·</w:t>
-      </w:r>
-      <w:proofErr w:type="gramEnd"/>
-      <w:r>
-        <w:rPr>
-          <w:rFonts w:ascii="Baskerville" w:hAnsi="Baskerville"/>
-          <w:color w:val="000000" w:themeColor="text1"/>
-          <w:sz w:val="18"/>
-          <w:szCs w:val="18"/>
-        </w:rPr>
-        <w:t xml:space="preserve">  Version </w:t>
-      </w:r>
-      <w:proofErr w:type="gramStart"/>
-      <w:r>
-        <w:rPr>
-          <w:rFonts w:ascii="Baskerville" w:hAnsi="Baskerville"/>
-          <w:color w:val="000000" w:themeColor="text1"/>
-          <w:sz w:val="18"/>
-          <w:szCs w:val="18"/>
-        </w:rPr>
-        <w:t>1.0  ·</w:t>
-      </w:r>
-      <w:proofErr w:type="gramEnd"/>
-      <w:r>
-        <w:rPr>
-          <w:rFonts w:ascii="Baskerville" w:hAnsi="Baskerville"/>
-          <w:color w:val="000000" w:themeColor="text1"/>
-          <w:sz w:val="18"/>
-          <w:szCs w:val="18"/>
-        </w:rPr>
-        <w:t xml:space="preserve">  Juin 2026</w:t>
+        <w:t>app.bluwa.com  ·  Version 1.1  ·  Juin 2026</w:t>
       </w:r>
     </w:p>
     <w:sectPr>
@@ -2404,36 +2592,57 @@
       <w:tabs>
         <w:tab w:val="right" w:pos="9026"/>
       </w:tabs>
+      <w:rPr>
+        <w:lang w:val="en-US"/>
+      </w:rPr>
     </w:pPr>
-    <w:proofErr w:type="gramStart"/>
+    <w:hyperlink r:id="rId1" w:history="1">
+      <w:r>
+        <w:rPr>
+          <w:rStyle w:val="Lienhypertexte"/>
+          <w:sz w:val="17"/>
+          <w:szCs w:val="17"/>
+        </w:rPr>
+        <w:t>https:/</w:t>
+      </w:r>
+      <w:r>
+        <w:rPr>
+          <w:rStyle w:val="Lienhypertexte"/>
+          <w:sz w:val="17"/>
+          <w:szCs w:val="17"/>
+        </w:rPr>
+        <w:t>/</w:t>
+      </w:r>
+      <w:r>
+        <w:rPr>
+          <w:rStyle w:val="Lienhypertexte"/>
+          <w:sz w:val="17"/>
+          <w:szCs w:val="17"/>
+        </w:rPr>
+        <w:t>bluwa.io/fr</w:t>
+      </w:r>
+    </w:hyperlink>
     <w:r>
       <w:rPr>
         <w:sz w:val="17"/>
         <w:szCs w:val="17"/>
       </w:rPr>
-      <w:t>www.bluwa.io</w:t>
+      <w:t xml:space="preserve">  </w:t>
     </w:r>
     <w:r>
       <w:rPr>
         <w:color w:val="999999"/>
         <w:sz w:val="17"/>
         <w:szCs w:val="17"/>
+        <w:lang w:val="en-US"/>
       </w:rPr>
-      <w:t xml:space="preserve">  —</w:t>
-    </w:r>
-    <w:proofErr w:type="gramEnd"/>
-    <w:r>
-      <w:rPr>
-        <w:color w:val="999999"/>
-        <w:sz w:val="17"/>
-        <w:szCs w:val="17"/>
-      </w:rPr>
-      <w:t xml:space="preserve">  john@bluwa.io</w:t>
+      <w:t>john@bluwa.io</w:t>
     </w:r>
     <w:r>
       <w:rPr>
         <w:sz w:val="17"/>
         <w:szCs w:val="17"/>
+        <w:lang w:val="en-US"/>
       </w:rPr>
       <w:tab/>
       <w:t xml:space="preserve">Page </w:t>
@@ -2449,6 +2658,7 @@
       <w:rPr>
         <w:sz w:val="17"/>
         <w:szCs w:val="17"/>
+        <w:lang w:val="en-US"/>
       </w:rPr>
       <w:instrText>PAGE</w:instrText>
     </w:r>
@@ -2464,6 +2674,7 @@
         <w:noProof/>
         <w:sz w:val="17"/>
         <w:szCs w:val="17"/>
+        <w:lang w:val="en-US"/>
       </w:rPr>
       <w:t>1</w:t>
     </w:r>
@@ -2478,6 +2689,7 @@
       <w:rPr>
         <w:sz w:val="17"/>
         <w:szCs w:val="17"/>
+        <w:lang w:val="en-US"/>
       </w:rPr>
       <w:t xml:space="preserve"> / </w:t>
     </w:r>
@@ -2492,6 +2704,7 @@
       <w:rPr>
         <w:sz w:val="17"/>
         <w:szCs w:val="17"/>
+        <w:lang w:val="en-US"/>
       </w:rPr>
       <w:instrText>NUMPAGES</w:instrText>
     </w:r>
@@ -2507,6 +2720,7 @@
         <w:noProof/>
         <w:sz w:val="17"/>
         <w:szCs w:val="17"/>
+        <w:lang w:val="en-US"/>
       </w:rPr>
       <w:t>2</w:t>
     </w:r>
@@ -3432,6 +3646,30 @@
     <w:uiPriority w:val="99"/>
     <w:rsid w:val="003F53BF"/>
   </w:style>
+  <w:style w:type="character" w:styleId="Mentionnonrsolue">
+    <w:name w:val="Unresolved Mention"/>
+    <w:basedOn w:val="Policepardfaut"/>
+    <w:uiPriority w:val="99"/>
+    <w:semiHidden/>
+    <w:unhideWhenUsed/>
+    <w:rsid w:val="002A0D61"/>
+    <w:rPr>
+      <w:color w:val="605E5C"/>
+      <w:shd w:val="clear" w:color="auto" w:fill="E1DFDD"/>
+    </w:rPr>
+  </w:style>
+  <w:style w:type="character" w:styleId="Lienhypertextesuivivisit">
+    <w:name w:val="FollowedHyperlink"/>
+    <w:basedOn w:val="Policepardfaut"/>
+    <w:uiPriority w:val="99"/>
+    <w:semiHidden/>
+    <w:unhideWhenUsed/>
+    <w:rsid w:val="002A0D61"/>
+    <w:rPr>
+      <w:color w:val="96607D" w:themeColor="followedHyperlink"/>
+      <w:u w:val="single"/>
+    </w:rPr>
+  </w:style>
 </w:styles>
 </file>
 

</xml_diff>

<commit_message>
docs(guide): add 3 screenshots in Étape 6 (articles page, form, import dialog)
v1.2 — Bluwa_Guide_Demarrage.docx
- Méthode A: screenshot "page articles.png" (vue générale avec bouton + Ajouter)
- Méthode A: screenshot "modal nouvelle article.png" (formulaire de saisie)
- Méthode B: screenshot "import_article.png" (dialog import CSV avec mapping)

Co-Authored-By: Claude Sonnet 4.6 <noreply@anthropic.com>
</commit_message>
<xml_diff>
--- a/docs/Bluwa_Guide_Demarrage.docx
+++ b/docs/Bluwa_Guide_Demarrage.docx
@@ -2242,6 +2242,52 @@
     </w:p>
     <w:p>
       <w:pPr>
+        <w:spacing w:before="80" w:after="80"/>
+        <w:jc w:val="center"/>
+      </w:pPr>
+      <w:r>
+        <w:drawing>
+          <wp:inline distT="0" distB="0" distL="0" distR="0" wp14:anchorId="AA01BB02" wp14:editId="CC03DD04">
+            <wp:extent cx="5429250" cy="2640657"/>
+            <wp:effectExtent l="0" t="0" r="0" b="0"/>
+            <wp:docPr id="1701000001" name="page_articles.png" descr="Page Articles - vue générale" title="Page Articles - vue générale"/>
+            <wp:cNvGraphicFramePr>
+              <a:graphicFrameLocks xmlns:a="http://schemas.openxmlformats.org/drawingml/2006/main" noChangeAspect="1"/>
+            </wp:cNvGraphicFramePr>
+            <a:graphic xmlns:a="http://schemas.openxmlformats.org/drawingml/2006/main">
+              <a:graphicData uri="http://schemas.openxmlformats.org/drawingml/2006/picture">
+                <pic:pic xmlns:pic="http://schemas.openxmlformats.org/drawingml/2006/picture">
+                  <pic:nvPicPr>
+                    <pic:cNvPr id="0" name=""/>
+                    <pic:cNvPicPr>
+                      <a:picLocks noChangeAspect="1" noChangeArrowheads="1"/>
+                    </pic:cNvPicPr>
+                  </pic:nvPicPr>
+                  <pic:blipFill>
+                    <a:blip r:embed="rId17"/>
+                    <a:srcRect/>
+                    <a:stretch>
+                      <a:fillRect/>
+                    </a:stretch>
+                  </pic:blipFill>
+                  <pic:spPr bwMode="auto">
+                    <a:xfrm>
+                      <a:off x="0" y="0"/>
+                      <a:ext cx="5429250" cy="2640657"/>
+                    </a:xfrm>
+                    <a:prstGeom prst="rect">
+                      <a:avLst/>
+                    </a:prstGeom>
+                  </pic:spPr>
+                </pic:pic>
+              </a:graphicData>
+            </a:graphic>
+          </wp:inline>
+        </w:drawing>
+      </w:r>
+    </w:p>
+    <w:p>
+      <w:pPr>
         <w:pStyle w:val="Paragraphedeliste"/>
         <w:numPr>
           <w:ilvl w:val="0"/>
@@ -2305,6 +2351,52 @@
     </w:p>
     <w:p>
       <w:pPr>
+        <w:spacing w:before="80" w:after="80"/>
+        <w:jc w:val="center"/>
+      </w:pPr>
+      <w:r>
+        <w:drawing>
+          <wp:inline distT="0" distB="0" distL="0" distR="0" wp14:anchorId="AA05BB06" wp14:editId="CC07DD08">
+            <wp:extent cx="5429250" cy="2633149"/>
+            <wp:effectExtent l="0" t="0" r="0" b="0"/>
+            <wp:docPr id="1701000002" name="modal_article.png" descr="Formulaire nouvel article" title="Formulaire nouvel article"/>
+            <wp:cNvGraphicFramePr>
+              <a:graphicFrameLocks xmlns:a="http://schemas.openxmlformats.org/drawingml/2006/main" noChangeAspect="1"/>
+            </wp:cNvGraphicFramePr>
+            <a:graphic xmlns:a="http://schemas.openxmlformats.org/drawingml/2006/main">
+              <a:graphicData uri="http://schemas.openxmlformats.org/drawingml/2006/picture">
+                <pic:pic xmlns:pic="http://schemas.openxmlformats.org/drawingml/2006/picture">
+                  <pic:nvPicPr>
+                    <pic:cNvPr id="0" name=""/>
+                    <pic:cNvPicPr>
+                      <a:picLocks noChangeAspect="1" noChangeArrowheads="1"/>
+                    </pic:cNvPicPr>
+                  </pic:nvPicPr>
+                  <pic:blipFill>
+                    <a:blip r:embed="rId18"/>
+                    <a:srcRect/>
+                    <a:stretch>
+                      <a:fillRect/>
+                    </a:stretch>
+                  </pic:blipFill>
+                  <pic:spPr bwMode="auto">
+                    <a:xfrm>
+                      <a:off x="0" y="0"/>
+                      <a:ext cx="5429250" cy="2633149"/>
+                    </a:xfrm>
+                    <a:prstGeom prst="rect">
+                      <a:avLst/>
+                    </a:prstGeom>
+                  </pic:spPr>
+                </pic:pic>
+              </a:graphicData>
+            </a:graphic>
+          </wp:inline>
+        </w:drawing>
+      </w:r>
+    </w:p>
+    <w:p>
+      <w:pPr>
         <w:spacing w:after="200"/>
         <w:rPr>
           <w:rFonts w:ascii="Baskerville" w:hAnsi="Baskerville"/>
@@ -2478,6 +2570,52 @@
           <w:color w:val="000000" w:themeColor="text1"/>
         </w:rPr>
         <w:t>Cliquez sur « Importer X lignes » pour confirmer</w:t>
+      </w:r>
+    </w:p>
+    <w:p>
+      <w:pPr>
+        <w:spacing w:before="80" w:after="80"/>
+        <w:jc w:val="center"/>
+      </w:pPr>
+      <w:r>
+        <w:drawing>
+          <wp:inline distT="0" distB="0" distL="0" distR="0" wp14:anchorId="AA09BB0A" wp14:editId="CC0BDD0C">
+            <wp:extent cx="5429250" cy="2638859"/>
+            <wp:effectExtent l="0" t="0" r="0" b="0"/>
+            <wp:docPr id="1701000003" name="import_article.png" descr="Dialog import CSV articles" title="Dialog import CSV articles"/>
+            <wp:cNvGraphicFramePr>
+              <a:graphicFrameLocks xmlns:a="http://schemas.openxmlformats.org/drawingml/2006/main" noChangeAspect="1"/>
+            </wp:cNvGraphicFramePr>
+            <a:graphic xmlns:a="http://schemas.openxmlformats.org/drawingml/2006/main">
+              <a:graphicData uri="http://schemas.openxmlformats.org/drawingml/2006/picture">
+                <pic:pic xmlns:pic="http://schemas.openxmlformats.org/drawingml/2006/picture">
+                  <pic:nvPicPr>
+                    <pic:cNvPr id="0" name=""/>
+                    <pic:cNvPicPr>
+                      <a:picLocks noChangeAspect="1" noChangeArrowheads="1"/>
+                    </pic:cNvPicPr>
+                  </pic:nvPicPr>
+                  <pic:blipFill>
+                    <a:blip r:embed="rId19"/>
+                    <a:srcRect/>
+                    <a:stretch>
+                      <a:fillRect/>
+                    </a:stretch>
+                  </pic:blipFill>
+                  <pic:spPr bwMode="auto">
+                    <a:xfrm>
+                      <a:off x="0" y="0"/>
+                      <a:ext cx="5429250" cy="2638859"/>
+                    </a:xfrm>
+                    <a:prstGeom prst="rect">
+                      <a:avLst/>
+                    </a:prstGeom>
+                  </pic:spPr>
+                </pic:pic>
+              </a:graphicData>
+            </a:graphic>
+          </wp:inline>
+        </w:drawing>
       </w:r>
     </w:p>
     <w:p>

</xml_diff>

<commit_message>
docs(guide): ajout étape CGU + restauration migrations 003-017
- Guide démarrage : insertion étape 3/7 (acceptation CGU) avec instructions détaillées
- Renumérotation cohérente des étapes 1→7
- Restauration migrations 003-017 supprimées lors du nettoyage BDD du 30 mai

Co-Authored-By: Claude Sonnet 4.6 <noreply@anthropic.com>
</commit_message>
<xml_diff>
--- a/docs/Bluwa_Guide_Demarrage.docx
+++ b/docs/Bluwa_Guide_Demarrage.docx
@@ -388,7 +388,7 @@
           <w:szCs w:val="18"/>
         </w:rPr>
         <w:lastRenderedPageBreak/>
-        <w:t>Étape 1 sur 5</w:t>
+        <w:t>Étape 1 sur 7</w:t>
       </w:r>
     </w:p>
     <w:p>
@@ -769,7 +769,7 @@
           <w:szCs w:val="18"/>
         </w:rPr>
         <w:lastRenderedPageBreak/>
-        <w:t>Étape 2 sur 5</w:t>
+        <w:t>Étape 2 sur 7</w:t>
       </w:r>
     </w:p>
     <w:p>
@@ -1034,7 +1034,165 @@
           <w:szCs w:val="18"/>
         </w:rPr>
         <w:lastRenderedPageBreak/>
-        <w:t>Étape 3 sur 5</w:t>
+        <w:t>Étape 3 sur 7</w:t>
+      </w:r>
+    </w:p>
+    <w:p>
+      <w:pPr>
+        <w:pStyle w:val="Titre1"/>
+        <w:pBdr>
+          <w:bottom w:val="single" w:sz="4" w:space="6" w:color="1B4BFF"/>
+        </w:pBdr>
+        <w:rPr>
+          <w:rFonts w:ascii="Baskerville" w:hAnsi="Baskerville"/>
+          <w:color w:val="000000" w:themeColor="text1"/>
+        </w:rPr>
+      </w:pPr>
+      <w:r>
+        <w:rPr>
+          <w:rFonts w:ascii="Baskerville" w:hAnsi="Baskerville"/>
+          <w:color w:val="000000" w:themeColor="text1"/>
+        </w:rPr>
+        <w:t>Accepter les Conditions Générales d’Utilisation</w:t>
+      </w:r>
+    </w:p>
+    <w:p>
+      <w:pPr>
+        <w:spacing w:after="120"/>
+        <w:rPr>
+          <w:rFonts w:ascii="Baskerville" w:hAnsi="Baskerville"/>
+          <w:color w:val="000000" w:themeColor="text1"/>
+        </w:rPr>
+      </w:pPr>
+      <w:r>
+        <w:rPr>
+          <w:rFonts w:ascii="Baskerville" w:hAnsi="Baskerville"/>
+          <w:color w:val="000000" w:themeColor="text1"/>
+        </w:rPr>
+        <w:t>Après votre première connexion, Bluwa ERP vous redirige automatiquement vers la page des Conditions Générales d’Utilisation (CGU). Vous devez les lire et les accepter avant d’accéder à la plateforme.</w:t>
+      </w:r>
+    </w:p>
+    <w:p>
+      <w:pPr>
+        <w:pStyle w:val="Paragraphedeliste"/>
+        <w:numPr>
+          <w:ilvl w:val="0"/>
+          <w:numId w:val="2"/>
+        </w:numPr>
+        <w:spacing w:after="80"/>
+        <w:rPr>
+          <w:rFonts w:ascii="Baskerville" w:hAnsi="Baskerville"/>
+          <w:color w:val="000000" w:themeColor="text1"/>
+        </w:rPr>
+      </w:pPr>
+      <w:r>
+        <w:rPr>
+          <w:rFonts w:ascii="Baskerville" w:hAnsi="Baskerville"/>
+          <w:color w:val="000000" w:themeColor="text1"/>
+        </w:rPr>
+        <w:t>Faites défiler le texte jusqu’en bas pour activer la case à cocher</w:t>
+      </w:r>
+    </w:p>
+    <w:p>
+      <w:pPr>
+        <w:pStyle w:val="Paragraphedeliste"/>
+        <w:numPr>
+          <w:ilvl w:val="0"/>
+          <w:numId w:val="2"/>
+        </w:numPr>
+        <w:spacing w:after="80"/>
+        <w:rPr>
+          <w:rFonts w:ascii="Baskerville" w:hAnsi="Baskerville"/>
+          <w:color w:val="000000" w:themeColor="text1"/>
+        </w:rPr>
+      </w:pPr>
+      <w:r>
+        <w:rPr>
+          <w:rFonts w:ascii="Baskerville" w:hAnsi="Baskerville"/>
+          <w:color w:val="000000" w:themeColor="text1"/>
+        </w:rPr>
+        <w:t>Cochez « J’ai lu et j’accepte les Conditions Générales d’Utilisation de Bluwa ERP (version 1.0) »</w:t>
+      </w:r>
+    </w:p>
+    <w:p>
+      <w:pPr>
+        <w:pStyle w:val="Paragraphedeliste"/>
+        <w:numPr>
+          <w:ilvl w:val="0"/>
+          <w:numId w:val="2"/>
+        </w:numPr>
+        <w:spacing w:after="80"/>
+        <w:rPr>
+          <w:rFonts w:ascii="Baskerville" w:hAnsi="Baskerville"/>
+          <w:color w:val="000000" w:themeColor="text1"/>
+        </w:rPr>
+      </w:pPr>
+      <w:r>
+        <w:rPr>
+          <w:rFonts w:ascii="Baskerville" w:hAnsi="Baskerville"/>
+          <w:color w:val="000000" w:themeColor="text1"/>
+        </w:rPr>
+        <w:t>Cliquez sur « Accepter et accéder à la plateforme »</w:t>
+      </w:r>
+    </w:p>
+    <w:p>
+      <w:pPr>
+        <w:shd w:val="clear" w:color="auto" w:fill="EEF4FF"/>
+        <w:spacing w:before="80" w:after="160"/>
+        <w:ind w:left="280" w:right="280"/>
+        <w:rPr>
+          <w:rFonts w:ascii="Baskerville" w:hAnsi="Baskerville"/>
+          <w:color w:val="000000" w:themeColor="text1"/>
+        </w:rPr>
+      </w:pPr>
+      <w:r>
+        <w:rPr>
+          <w:rFonts w:ascii="Apple Color Emoji" w:hAnsi="Apple Color Emoji" w:cs="Apple Color Emoji"/>
+          <w:color w:val="000000" w:themeColor="text1"/>
+          <w:sz w:val="20"/>
+          <w:szCs w:val="20"/>
+        </w:rPr>
+        <w:t>ℹ️</w:t>
+      </w:r>
+      <w:r>
+        <w:rPr>
+          <w:rFonts w:ascii="Baskerville" w:hAnsi="Baskerville"/>
+          <w:color w:val="000000" w:themeColor="text1"/>
+          <w:sz w:val="20"/>
+          <w:szCs w:val="20"/>
+        </w:rPr>
+        <w:t xml:space="preserve">  </w:t>
+      </w:r>
+      <w:r>
+        <w:rPr>
+          <w:rFonts w:ascii="Baskerville" w:hAnsi="Baskerville"/>
+          <w:i/>
+          <w:iCs/>
+          <w:color w:val="000000" w:themeColor="text1"/>
+          <w:sz w:val="20"/>
+          <w:szCs w:val="20"/>
+        </w:rPr>
+        <w:t>Les CGU sont à accepter une seule fois par utilisateur. En cas de mise à jour, vous serez invité à les accepter à nouveau.</w:t>
+      </w:r>
+    </w:p>
+    <w:p>
+      <w:pPr>
+        <w:spacing w:before="320" w:after="100"/>
+        <w:rPr>
+          <w:rFonts w:ascii="Baskerville" w:hAnsi="Baskerville"/>
+          <w:color w:val="000000" w:themeColor="text1"/>
+        </w:rPr>
+      </w:pPr>
+      <w:r>
+        <w:rPr>
+          <w:rFonts w:ascii="Baskerville" w:hAnsi="Baskerville"/>
+          <w:b/>
+          <w:bCs/>
+          <w:color w:val="000000" w:themeColor="text1"/>
+          <w:sz w:val="18"/>
+          <w:szCs w:val="18"/>
+        </w:rPr>
+        <w:t>Étape 4 sur 7</w:t>
       </w:r>
     </w:p>
     <w:p>
@@ -1221,9 +1379,9 @@
           <w:color w:val="000000" w:themeColor="text1"/>
         </w:rPr>
         <w:drawing>
-          <wp:inline distT="0" distB="0" distL="0" distR="0" wp14:anchorId="6F2C6640" wp14:editId="4F18D211">
-            <wp:extent cx="5429250" cy="3533775"/>
-            <wp:effectExtent l="0" t="0" r="6350" b="0"/>
+          <wp:inline distT="0" distB="0" distL="0" distR="0" wp14:anchorId="6F2C6640" wp14:editId="00591754">
+            <wp:extent cx="5428574" cy="3064933"/>
+            <wp:effectExtent l="0" t="0" r="0" b="0"/>
             <wp:docPr id="1380138437" name="image-1780755826039.jpg" descr="image-1780755826039.jpg" title="image-1780755826039.jpg"/>
             <wp:cNvGraphicFramePr>
               <a:graphicFrameLocks xmlns:a="http://schemas.openxmlformats.org/drawingml/2006/main" noChangeAspect="1"/>
@@ -1237,9 +1395,9 @@
                       <a:picLocks noChangeAspect="1" noChangeArrowheads="1"/>
                     </pic:cNvPicPr>
                   </pic:nvPicPr>
-                  <pic:blipFill>
+                  <pic:blipFill rotWithShape="1">
                     <a:blip r:embed="rId10"/>
-                    <a:srcRect/>
+                    <a:srcRect t="3833" b="9423"/>
                     <a:stretch>
                       <a:fillRect/>
                     </a:stretch>
@@ -1247,11 +1405,19 @@
                   <pic:spPr bwMode="auto">
                     <a:xfrm>
                       <a:off x="0" y="0"/>
-                      <a:ext cx="5429250" cy="3533775"/>
+                      <a:ext cx="5429250" cy="3065315"/>
                     </a:xfrm>
                     <a:prstGeom prst="rect">
                       <a:avLst/>
                     </a:prstGeom>
+                    <a:ln>
+                      <a:noFill/>
+                    </a:ln>
+                    <a:extLst>
+                      <a:ext uri="{53640926-AAD7-44D8-BBD7-CCE9431645EC}">
+                        <a14:shadowObscured xmlns:a14="http://schemas.microsoft.com/office/drawing/2010/main"/>
+                      </a:ext>
+                    </a:extLst>
                   </pic:spPr>
                 </pic:pic>
               </a:graphicData>
@@ -1314,7 +1480,7 @@
           <w:szCs w:val="18"/>
         </w:rPr>
         <w:lastRenderedPageBreak/>
-        <w:t>Étape 4 sur 5</w:t>
+        <w:t>Étape 5 sur 7</w:t>
       </w:r>
     </w:p>
     <w:p>
@@ -1485,8 +1651,8 @@
           <w:color w:val="000000" w:themeColor="text1"/>
         </w:rPr>
         <w:drawing>
-          <wp:inline distT="0" distB="0" distL="0" distR="0" wp14:anchorId="7429EFE0" wp14:editId="07E45B5D">
-            <wp:extent cx="5429250" cy="3533775"/>
+          <wp:inline distT="0" distB="0" distL="0" distR="0" wp14:anchorId="7429EFE0" wp14:editId="6DC43481">
+            <wp:extent cx="5428615" cy="2912414"/>
             <wp:effectExtent l="0" t="0" r="0" b="0"/>
             <wp:docPr id="2110868416" name="image-1780755880122.jpg" descr="image-1780755880122.jpg" title="image-1780755880122.jpg"/>
             <wp:cNvGraphicFramePr>
@@ -1501,9 +1667,9 @@
                       <a:picLocks noChangeAspect="1" noChangeArrowheads="1"/>
                     </pic:cNvPicPr>
                   </pic:nvPicPr>
-                  <pic:blipFill>
+                  <pic:blipFill rotWithShape="1">
                     <a:blip r:embed="rId11"/>
-                    <a:srcRect/>
+                    <a:srcRect t="8625" b="8949"/>
                     <a:stretch>
                       <a:fillRect/>
                     </a:stretch>
@@ -1511,11 +1677,19 @@
                   <pic:spPr bwMode="auto">
                     <a:xfrm>
                       <a:off x="0" y="0"/>
-                      <a:ext cx="5429250" cy="3533775"/>
+                      <a:ext cx="5429250" cy="2912755"/>
                     </a:xfrm>
                     <a:prstGeom prst="rect">
                       <a:avLst/>
                     </a:prstGeom>
+                    <a:ln>
+                      <a:noFill/>
+                    </a:ln>
+                    <a:extLst>
+                      <a:ext uri="{53640926-AAD7-44D8-BBD7-CCE9431645EC}">
+                        <a14:shadowObscured xmlns:a14="http://schemas.microsoft.com/office/drawing/2010/main"/>
+                      </a:ext>
+                    </a:extLst>
                   </pic:spPr>
                 </pic:pic>
               </a:graphicData>
@@ -1618,7 +1792,7 @@
           <w:szCs w:val="18"/>
         </w:rPr>
         <w:lastRenderedPageBreak/>
-        <w:t>Étape 5 sur 5</w:t>
+        <w:t>Étape 6 sur 7</w:t>
       </w:r>
     </w:p>
     <w:p>
@@ -1861,7 +2035,7 @@
           <w:color w:val="000000" w:themeColor="text1"/>
         </w:rPr>
         <w:drawing>
-          <wp:inline distT="0" distB="0" distL="0" distR="0" wp14:anchorId="5E91C358" wp14:editId="18FFE887">
+          <wp:inline distT="0" distB="0" distL="0" distR="0" wp14:anchorId="5E91C358" wp14:editId="5E83E02E">
             <wp:extent cx="5429250" cy="3533775"/>
             <wp:effectExtent l="0" t="0" r="0" b="0"/>
             <wp:docPr id="1766232374" name="image-1780755895995.jpg" descr="image-1780755895995.jpg" title="image-1780755895995.jpg"/>
@@ -2135,7 +2309,6 @@
     </w:p>
     <w:p>
       <w:pPr>
-        <w:spacing w:before="0" w:after="0"/>
         <w:rPr>
           <w:rFonts w:ascii="Baskerville" w:hAnsi="Baskerville"/>
           <w:color w:val="000000" w:themeColor="text1"/>
@@ -2166,7 +2339,8 @@
           <w:sz w:val="18"/>
           <w:szCs w:val="18"/>
         </w:rPr>
-        <w:t>Étape 6 sur 6</w:t>
+        <w:lastRenderedPageBreak/>
+        <w:t>Étape 7 sur 7</w:t>
       </w:r>
     </w:p>
     <w:p>
@@ -2246,6 +2420,9 @@
         <w:jc w:val="center"/>
       </w:pPr>
       <w:r>
+        <w:rPr>
+          <w:noProof/>
+        </w:rPr>
         <w:drawing>
           <wp:inline distT="0" distB="0" distL="0" distR="0" wp14:anchorId="AA01BB02" wp14:editId="CC03DD04">
             <wp:extent cx="5429250" cy="2640657"/>
@@ -2264,7 +2441,7 @@
                     </pic:cNvPicPr>
                   </pic:nvPicPr>
                   <pic:blipFill>
-                    <a:blip r:embed="rId17"/>
+                    <a:blip r:embed="rId13"/>
                     <a:srcRect/>
                     <a:stretch>
                       <a:fillRect/>
@@ -2355,6 +2532,9 @@
         <w:jc w:val="center"/>
       </w:pPr>
       <w:r>
+        <w:rPr>
+          <w:noProof/>
+        </w:rPr>
         <w:drawing>
           <wp:inline distT="0" distB="0" distL="0" distR="0" wp14:anchorId="AA05BB06" wp14:editId="CC07DD08">
             <wp:extent cx="5429250" cy="2633149"/>
@@ -2373,7 +2553,7 @@
                     </pic:cNvPicPr>
                   </pic:nvPicPr>
                   <pic:blipFill>
-                    <a:blip r:embed="rId18"/>
+                    <a:blip r:embed="rId14"/>
                     <a:srcRect/>
                     <a:stretch>
                       <a:fillRect/>
@@ -2506,6 +2686,7 @@
           <w:rFonts w:ascii="Baskerville" w:hAnsi="Baskerville"/>
           <w:color w:val="000000" w:themeColor="text1"/>
         </w:rPr>
+        <w:lastRenderedPageBreak/>
         <w:t>Cliquez sur l’icône « Importer » en haut à droite</w:t>
       </w:r>
     </w:p>
@@ -2578,6 +2759,9 @@
         <w:jc w:val="center"/>
       </w:pPr>
       <w:r>
+        <w:rPr>
+          <w:noProof/>
+        </w:rPr>
         <w:drawing>
           <wp:inline distT="0" distB="0" distL="0" distR="0" wp14:anchorId="AA09BB0A" wp14:editId="CC0BDD0C">
             <wp:extent cx="5429250" cy="2638859"/>
@@ -2596,7 +2780,7 @@
                     </pic:cNvPicPr>
                   </pic:nvPicPr>
                   <pic:blipFill>
-                    <a:blip r:embed="rId19"/>
+                    <a:blip r:embed="rId15"/>
                     <a:srcRect/>
                     <a:stretch>
                       <a:fillRect/>
@@ -2690,8 +2874,8 @@
       </w:r>
     </w:p>
     <w:sectPr>
-      <w:headerReference w:type="default" r:id="rId13"/>
-      <w:footerReference w:type="default" r:id="rId14"/>
+      <w:headerReference w:type="default" r:id="rId16"/>
+      <w:footerReference w:type="default" r:id="rId17"/>
       <w:pgSz w:w="11906" w:h="16838"/>
       <w:pgMar w:top="1134" w:right="1134" w:bottom="1134" w:left="1134" w:header="708" w:footer="708" w:gutter="0"/>
       <w:cols w:space="720"/>
@@ -2741,23 +2925,7 @@
           <w:sz w:val="17"/>
           <w:szCs w:val="17"/>
         </w:rPr>
-        <w:t>https:/</w:t>
-      </w:r>
-      <w:r>
-        <w:rPr>
-          <w:rStyle w:val="Lienhypertexte"/>
-          <w:sz w:val="17"/>
-          <w:szCs w:val="17"/>
-        </w:rPr>
-        <w:t>/</w:t>
-      </w:r>
-      <w:r>
-        <w:rPr>
-          <w:rStyle w:val="Lienhypertexte"/>
-          <w:sz w:val="17"/>
-          <w:szCs w:val="17"/>
-        </w:rPr>
-        <w:t>bluwa.io/fr</w:t>
+        <w:t>https://bluwa.io/fr</w:t>
       </w:r>
     </w:hyperlink>
     <w:r>

</xml_diff>

<commit_message>
docs: ajouter section Règles de Gestion Strictes du Référentiel
4 règles : blocage flux PF/PSF, état QC/Quarantaine, champs figés Actif/Bloqué, procédure évolution article

Co-Authored-By: Claude Sonnet 4.6 <noreply@anthropic.com>
</commit_message>
<xml_diff>
--- a/docs/Bluwa_Guide_Demarrage.docx
+++ b/docs/Bluwa_Guide_Demarrage.docx
@@ -2840,6 +2840,377 @@
           <w:szCs w:val="20"/>
         </w:rPr>
         <w:t>Les codes articles, fournisseurs et clients sont générés automatiquement si vous laissez la colonne vide. Vous pouvez les modifier depuis l’application à tout moment.</w:t>
+      </w:r>
+    </w:p>
+    <w:p>
+      <w:pPr>
+        <w:pStyle w:val="Titre1"/>
+        <w:pBdr>
+          <w:bottom w:val="single" w:sz="4" w:space="6" w:color="1B4BFF"/>
+        </w:pBdr>
+        <w:rPr>
+          <w:rFonts w:ascii="Baskerville" w:hAnsi="Baskerville"/>
+          <w:color w:val="000000" w:themeColor="text1"/>
+        </w:rPr>
+      </w:pPr>
+      <w:r>
+        <w:rPr>
+          <w:rFonts w:ascii="Baskerville" w:hAnsi="Baskerville"/>
+          <w:color w:val="000000" w:themeColor="text1"/>
+        </w:rPr>
+        <w:t>Règles de Gestion Strictes du Référentiel</w:t>
+      </w:r>
+    </w:p>
+    <w:p>
+      <w:pPr>
+        <w:pStyle w:val="Titre2"/>
+        <w:rPr>
+          <w:rFonts w:ascii="Baskerville" w:hAnsi="Baskerville"/>
+          <w:color w:val="000000" w:themeColor="text1"/>
+        </w:rPr>
+      </w:pPr>
+      <w:r>
+        <w:rPr>
+          <w:rFonts w:ascii="Baskerville" w:hAnsi="Baskerville"/>
+          <w:color w:val="000000" w:themeColor="text1"/>
+        </w:rPr>
+        <w:t>1/ Blocage des flux</w:t>
+      </w:r>
+    </w:p>
+    <w:p>
+      <w:pPr>
+        <w:spacing w:after="120"/>
+        <w:rPr>
+          <w:rFonts w:ascii="Baskerville" w:hAnsi="Baskerville"/>
+          <w:color w:val="000000" w:themeColor="text1"/>
+        </w:rPr>
+      </w:pPr>
+      <w:r>
+        <w:rPr>
+          <w:rFonts w:ascii="Baskerville" w:hAnsi="Baskerville"/>
+          <w:color w:val="000000" w:themeColor="text1"/>
+        </w:rPr>
+        <w:t xml:space="preserve">Interdiction stricte de faire une réception fournisseur directe (achat spot / terrain) sur des produits de type </w:t>
+      </w:r>
+      <w:r>
+        <w:rPr>
+          <w:rFonts w:ascii="Baskerville" w:hAnsi="Baskerville"/>
+          <w:b/>
+          <w:bCs/>
+          <w:color w:val="000000" w:themeColor="text1"/>
+        </w:rPr>
+        <w:t>PF</w:t>
+      </w:r>
+      <w:r>
+        <w:rPr>
+          <w:rFonts w:ascii="Baskerville" w:hAnsi="Baskerville"/>
+          <w:color w:val="000000" w:themeColor="text1"/>
+        </w:rPr>
+        <w:t xml:space="preserve"> ou </w:t>
+      </w:r>
+      <w:r>
+        <w:rPr>
+          <w:rFonts w:ascii="Baskerville" w:hAnsi="Baskerville"/>
+          <w:b/>
+          <w:bCs/>
+          <w:color w:val="000000" w:themeColor="text1"/>
+        </w:rPr>
+        <w:t>PSF</w:t>
+      </w:r>
+      <w:r>
+        <w:rPr>
+          <w:rFonts w:ascii="Baskerville" w:hAnsi="Baskerville"/>
+          <w:color w:val="000000" w:themeColor="text1"/>
+        </w:rPr>
+        <w:t xml:space="preserve">. Seuls les types </w:t>
+      </w:r>
+      <w:r>
+        <w:rPr>
+          <w:rFonts w:ascii="Baskerville" w:hAnsi="Baskerville"/>
+          <w:b/>
+          <w:bCs/>
+          <w:color w:val="000000" w:themeColor="text1"/>
+        </w:rPr>
+        <w:t>MP, CS et AC</w:t>
+      </w:r>
+      <w:r>
+        <w:rPr>
+          <w:rFonts w:ascii="Baskerville" w:hAnsi="Baskerville"/>
+          <w:color w:val="000000" w:themeColor="text1"/>
+        </w:rPr>
+        <w:t xml:space="preserve"> sont autorisés pour une réception directe fournisseur.</w:t>
+      </w:r>
+    </w:p>
+    <w:p>
+      <w:pPr>
+        <w:pStyle w:val="Titre2"/>
+        <w:rPr>
+          <w:rFonts w:ascii="Baskerville" w:hAnsi="Baskerville"/>
+          <w:color w:val="000000" w:themeColor="text1"/>
+        </w:rPr>
+      </w:pPr>
+      <w:r>
+        <w:rPr>
+          <w:rFonts w:ascii="Baskerville" w:hAnsi="Baskerville"/>
+          <w:color w:val="000000" w:themeColor="text1"/>
+        </w:rPr>
+        <w:t>2/ Statut QC &amp; Stocks</w:t>
+      </w:r>
+    </w:p>
+    <w:p>
+      <w:pPr>
+        <w:spacing w:after="120"/>
+        <w:rPr>
+          <w:rFonts w:ascii="Baskerville" w:hAnsi="Baskerville"/>
+          <w:color w:val="000000" w:themeColor="text1"/>
+        </w:rPr>
+      </w:pPr>
+      <w:r>
+        <w:rPr>
+          <w:rFonts w:ascii="Baskerville" w:hAnsi="Baskerville"/>
+          <w:color w:val="000000" w:themeColor="text1"/>
+        </w:rPr>
+        <w:t xml:space="preserve">Alignement automatique. Tout lot avec un statut QC </w:t>
+      </w:r>
+      <w:r>
+        <w:rPr>
+          <w:rFonts w:ascii="Baskerville" w:hAnsi="Baskerville"/>
+          <w:b/>
+          <w:bCs/>
+          <w:color w:val="000000" w:themeColor="text1"/>
+        </w:rPr>
+        <w:t>‘En contrôle’</w:t>
+      </w:r>
+      <w:r>
+        <w:rPr>
+          <w:rFonts w:ascii="Baskerville" w:hAnsi="Baskerville"/>
+          <w:color w:val="000000" w:themeColor="text1"/>
+        </w:rPr>
+        <w:t xml:space="preserve"> ou </w:t>
+      </w:r>
+      <w:r>
+        <w:rPr>
+          <w:rFonts w:ascii="Baskerville" w:hAnsi="Baskerville"/>
+          <w:b/>
+          <w:bCs/>
+          <w:color w:val="000000" w:themeColor="text1"/>
+        </w:rPr>
+        <w:t>‘Rejeté’</w:t>
+      </w:r>
+      <w:r>
+        <w:rPr>
+          <w:rFonts w:ascii="Baskerville" w:hAnsi="Baskerville"/>
+          <w:color w:val="000000" w:themeColor="text1"/>
+        </w:rPr>
+        <w:t xml:space="preserve"> bascule obligatoirement en état </w:t>
+      </w:r>
+      <w:r>
+        <w:rPr>
+          <w:rFonts w:ascii="Baskerville" w:hAnsi="Baskerville"/>
+          <w:b/>
+          <w:bCs/>
+          <w:color w:val="000000" w:themeColor="text1"/>
+        </w:rPr>
+        <w:t>‘Quarantaine’</w:t>
+      </w:r>
+      <w:r>
+        <w:rPr>
+          <w:rFonts w:ascii="Baskerville" w:hAnsi="Baskerville"/>
+          <w:color w:val="000000" w:themeColor="text1"/>
+        </w:rPr>
+        <w:t xml:space="preserve">. Seul le statut QC </w:t>
+      </w:r>
+      <w:r>
+        <w:rPr>
+          <w:rFonts w:ascii="Baskerville" w:hAnsi="Baskerville"/>
+          <w:b/>
+          <w:bCs/>
+          <w:color w:val="000000" w:themeColor="text1"/>
+        </w:rPr>
+        <w:t>‘Libéré’</w:t>
+      </w:r>
+      <w:r>
+        <w:rPr>
+          <w:rFonts w:ascii="Baskerville" w:hAnsi="Baskerville"/>
+          <w:color w:val="000000" w:themeColor="text1"/>
+        </w:rPr>
+        <w:t xml:space="preserve"> permet l’état </w:t>
+      </w:r>
+      <w:r>
+        <w:rPr>
+          <w:rFonts w:ascii="Baskerville" w:hAnsi="Baskerville"/>
+          <w:b/>
+          <w:bCs/>
+          <w:color w:val="000000" w:themeColor="text1"/>
+        </w:rPr>
+        <w:t>‘Disponible’</w:t>
+      </w:r>
+      <w:r>
+        <w:rPr>
+          <w:rFonts w:ascii="Baskerville" w:hAnsi="Baskerville"/>
+          <w:color w:val="000000" w:themeColor="text1"/>
+        </w:rPr>
+        <w:t>.</w:t>
+      </w:r>
+    </w:p>
+    <w:p>
+      <w:pPr>
+        <w:pStyle w:val="Titre2"/>
+        <w:rPr>
+          <w:rFonts w:ascii="Baskerville" w:hAnsi="Baskerville"/>
+          <w:color w:val="000000" w:themeColor="text1"/>
+        </w:rPr>
+      </w:pPr>
+      <w:r>
+        <w:rPr>
+          <w:rFonts w:ascii="Baskerville" w:hAnsi="Baskerville"/>
+          <w:color w:val="000000" w:themeColor="text1"/>
+        </w:rPr>
+        <w:t>3/ Cycle de vie Article</w:t>
+      </w:r>
+    </w:p>
+    <w:p>
+      <w:pPr>
+        <w:spacing w:after="120"/>
+        <w:rPr>
+          <w:rFonts w:ascii="Baskerville" w:hAnsi="Baskerville"/>
+          <w:color w:val="000000" w:themeColor="text1"/>
+        </w:rPr>
+      </w:pPr>
+      <w:r>
+        <w:rPr>
+          <w:rFonts w:ascii="Baskerville" w:hAnsi="Baskerville"/>
+          <w:color w:val="000000" w:themeColor="text1"/>
+        </w:rPr>
+        <w:t xml:space="preserve">Si le statut d’un article est </w:t>
+      </w:r>
+      <w:r>
+        <w:rPr>
+          <w:rFonts w:ascii="Baskerville" w:hAnsi="Baskerville"/>
+          <w:b/>
+          <w:bCs/>
+          <w:color w:val="000000" w:themeColor="text1"/>
+        </w:rPr>
+        <w:t>‘Actif’</w:t>
+      </w:r>
+      <w:r>
+        <w:rPr>
+          <w:rFonts w:ascii="Baskerville" w:hAnsi="Baskerville"/>
+          <w:color w:val="000000" w:themeColor="text1"/>
+        </w:rPr>
+        <w:t xml:space="preserve"> ou </w:t>
+      </w:r>
+      <w:r>
+        <w:rPr>
+          <w:rFonts w:ascii="Baskerville" w:hAnsi="Baskerville"/>
+          <w:b/>
+          <w:bCs/>
+          <w:color w:val="000000" w:themeColor="text1"/>
+        </w:rPr>
+        <w:t>‘Bloqué’</w:t>
+      </w:r>
+      <w:r>
+        <w:rPr>
+          <w:rFonts w:ascii="Baskerville" w:hAnsi="Baskerville"/>
+          <w:color w:val="000000" w:themeColor="text1"/>
+        </w:rPr>
+        <w:t xml:space="preserve">, les champs critiques (</w:t>
+      </w:r>
+      <w:r>
+        <w:rPr>
+          <w:rFonts w:ascii="Baskerville" w:hAnsi="Baskerville"/>
+          <w:b/>
+          <w:bCs/>
+          <w:color w:val="000000" w:themeColor="text1"/>
+        </w:rPr>
+        <w:t>Code / SKU, Type, Unités, Conversions</w:t>
+      </w:r>
+      <w:r>
+        <w:rPr>
+          <w:rFonts w:ascii="Baskerville" w:hAnsi="Baskerville"/>
+          <w:color w:val="000000" w:themeColor="text1"/>
+        </w:rPr>
+        <w:t xml:space="preserve">) sont figés en lecture seule pour protéger l’historique. Ils ne sont modifiables que si le statut est </w:t>
+      </w:r>
+      <w:r>
+        <w:rPr>
+          <w:rFonts w:ascii="Baskerville" w:hAnsi="Baskerville"/>
+          <w:b/>
+          <w:bCs/>
+          <w:color w:val="000000" w:themeColor="text1"/>
+        </w:rPr>
+        <w:t>‘En création’</w:t>
+      </w:r>
+      <w:r>
+        <w:rPr>
+          <w:rFonts w:ascii="Baskerville" w:hAnsi="Baskerville"/>
+          <w:color w:val="000000" w:themeColor="text1"/>
+        </w:rPr>
+        <w:t>.</w:t>
+      </w:r>
+    </w:p>
+    <w:p>
+      <w:pPr>
+        <w:pStyle w:val="Titre2"/>
+        <w:rPr>
+          <w:rFonts w:ascii="Baskerville" w:hAnsi="Baskerville"/>
+          <w:color w:val="000000" w:themeColor="text1"/>
+        </w:rPr>
+      </w:pPr>
+      <w:r>
+        <w:rPr>
+          <w:rFonts w:ascii="Baskerville" w:hAnsi="Baskerville"/>
+          <w:color w:val="000000" w:themeColor="text1"/>
+        </w:rPr>
+        <w:t>4/ Évolution Article</w:t>
+      </w:r>
+    </w:p>
+    <w:p>
+      <w:pPr>
+        <w:spacing w:after="280"/>
+        <w:rPr>
+          <w:rFonts w:ascii="Baskerville" w:hAnsi="Baskerville"/>
+          <w:color w:val="000000" w:themeColor="text1"/>
+        </w:rPr>
+      </w:pPr>
+      <w:r>
+        <w:rPr>
+          <w:rFonts w:ascii="Baskerville" w:hAnsi="Baskerville"/>
+          <w:color w:val="000000" w:themeColor="text1"/>
+        </w:rPr>
+        <w:t xml:space="preserve">Pour faire évoluer un article, il faut </w:t>
+      </w:r>
+      <w:r>
+        <w:rPr>
+          <w:rFonts w:ascii="Baskerville" w:hAnsi="Baskerville"/>
+          <w:b/>
+          <w:bCs/>
+          <w:color w:val="000000" w:themeColor="text1"/>
+        </w:rPr>
+        <w:t>créer une nouvelle fiche</w:t>
+      </w:r>
+      <w:r>
+        <w:rPr>
+          <w:rFonts w:ascii="Baskerville" w:hAnsi="Baskerville"/>
+          <w:color w:val="000000" w:themeColor="text1"/>
+        </w:rPr>
+        <w:t xml:space="preserve"> (nouvelle version), épuiser l’ancien stock jusqu’à 0, puis </w:t>
+      </w:r>
+      <w:r>
+        <w:rPr>
+          <w:rFonts w:ascii="Baskerville" w:hAnsi="Baskerville"/>
+          <w:b/>
+          <w:bCs/>
+          <w:color w:val="000000" w:themeColor="text1"/>
+        </w:rPr>
+        <w:t>archiver l’ancienne fiche</w:t>
+      </w:r>
+      <w:r>
+        <w:rPr>
+          <w:rFonts w:ascii="Baskerville" w:hAnsi="Baskerville"/>
+          <w:color w:val="000000" w:themeColor="text1"/>
+        </w:rPr>
+        <w:t>.</w:t>
       </w:r>
     </w:p>
     <w:p>

</xml_diff>

<commit_message>
docs: ajouter Manuel des Procédures — Achats, Réceptions & Inventaires
3 sous-sections : Approvisionnements (BC/BA), Réception & lots QC, Inventaires
Balises screenshot insérées aux emplacements indiqués

Co-Authored-By: Claude Sonnet 4.6 <noreply@anthropic.com>
</commit_message>
<xml_diff>
--- a/docs/Bluwa_Guide_Demarrage.docx
+++ b/docs/Bluwa_Guide_Demarrage.docx
@@ -3211,6 +3211,455 @@
           <w:color w:val="000000" w:themeColor="text1"/>
         </w:rPr>
         <w:t>.</w:t>
+      </w:r>
+    </w:p>
+    <w:p>
+      <w:pPr>
+        <w:pStyle w:val="Titre1"/>
+        <w:pBdr>
+          <w:bottom w:val="single" w:sz="4" w:space="6" w:color="1B4BFF"/>
+        </w:pBdr>
+        <w:rPr>
+          <w:rFonts w:ascii="Baskerville" w:hAnsi="Baskerville"/>
+          <w:color w:val="000000" w:themeColor="text1"/>
+        </w:rPr>
+      </w:pPr>
+      <w:r>
+        <w:rPr>
+          <w:rFonts w:ascii="Baskerville" w:hAnsi="Baskerville"/>
+          <w:color w:val="000000" w:themeColor="text1"/>
+        </w:rPr>
+        <w:t>Manuel des Procédures : Achats, Réceptions &amp; Inventaires</w:t>
+      </w:r>
+    </w:p>
+    <w:p>
+      <w:pPr>
+        <w:pStyle w:val="Titre2"/>
+        <w:rPr>
+          <w:rFonts w:ascii="Baskerville" w:hAnsi="Baskerville"/>
+          <w:color w:val="000000" w:themeColor="text1"/>
+        </w:rPr>
+      </w:pPr>
+      <w:r>
+        <w:rPr>
+          <w:rFonts w:ascii="Baskerville" w:hAnsi="Baskerville"/>
+          <w:color w:val="000000" w:themeColor="text1"/>
+        </w:rPr>
+        <w:t>1/ Gestion des Approvisionnements</w:t>
+      </w:r>
+    </w:p>
+    <w:p>
+      <w:pPr>
+        <w:pStyle w:val="Paragraphedeliste"/>
+        <w:numPr>
+          <w:ilvl w:val="0"/>
+          <w:numId w:val="2"/>
+        </w:numPr>
+        <w:spacing w:after="80"/>
+        <w:rPr>
+          <w:rFonts w:ascii="Baskerville" w:hAnsi="Baskerville"/>
+          <w:color w:val="000000" w:themeColor="text1"/>
+        </w:rPr>
+      </w:pPr>
+      <w:r>
+        <w:rPr>
+          <w:rFonts w:ascii="Baskerville" w:hAnsi="Baskerville"/>
+          <w:color w:val="000000" w:themeColor="text1"/>
+        </w:rPr>
+        <w:t xml:space="preserve">Pour créer une pièce, l’utilisateur clique sur le bouton bleu </w:t>
+      </w:r>
+      <w:r>
+        <w:rPr>
+          <w:rFonts w:ascii="Baskerville" w:hAnsi="Baskerville"/>
+          <w:b/>
+          <w:bCs/>
+          <w:color w:val="000000" w:themeColor="text1"/>
+        </w:rPr>
+        <w:t>[+ Nouvelle commande]</w:t>
+      </w:r>
+      <w:r>
+        <w:rPr>
+          <w:rFonts w:ascii="Baskerville" w:hAnsi="Baskerville"/>
+          <w:color w:val="000000" w:themeColor="text1"/>
+        </w:rPr>
+        <w:t>.</w:t>
+      </w:r>
+    </w:p>
+    <w:p>
+      <w:pPr>
+        <w:pStyle w:val="Paragraphedeliste"/>
+        <w:numPr>
+          <w:ilvl w:val="0"/>
+          <w:numId w:val="2"/>
+        </w:numPr>
+        <w:spacing w:after="80"/>
+        <w:rPr>
+          <w:rFonts w:ascii="Baskerville" w:hAnsi="Baskerville"/>
+          <w:color w:val="000000" w:themeColor="text1"/>
+        </w:rPr>
+      </w:pPr>
+      <w:r>
+        <w:rPr>
+          <w:rFonts w:ascii="Baskerville" w:hAnsi="Baskerville"/>
+          <w:b/>
+          <w:bCs/>
+          <w:color w:val="000000" w:themeColor="text1"/>
+        </w:rPr>
+        <w:t xml:space="preserve">BC (Bon de Commande)</w:t>
+      </w:r>
+      <w:r>
+        <w:rPr>
+          <w:rFonts w:ascii="Baskerville" w:hAnsi="Baskerville"/>
+          <w:color w:val="000000" w:themeColor="text1"/>
+        </w:rPr>
+        <w:t xml:space="preserve"> : Type bleu </w:t>
+      </w:r>
+      <w:r>
+        <w:rPr>
+          <w:rFonts w:ascii="Baskerville" w:hAnsi="Baskerville"/>
+          <w:b/>
+          <w:bCs/>
+          <w:color w:val="000000" w:themeColor="text1"/>
+        </w:rPr>
+        <w:t>[BC]</w:t>
+      </w:r>
+      <w:r>
+        <w:rPr>
+          <w:rFonts w:ascii="Baskerville" w:hAnsi="Baskerville"/>
+          <w:color w:val="000000" w:themeColor="text1"/>
+        </w:rPr>
+        <w:t xml:space="preserve"> utilisé pour les fournisseurs formels (ex : Bocaux &amp; Fils). Généré suite aux suggestions MRP.</w:t>
+      </w:r>
+    </w:p>
+    <w:p>
+      <w:pPr>
+        <w:pStyle w:val="Paragraphedeliste"/>
+        <w:numPr>
+          <w:ilvl w:val="0"/>
+          <w:numId w:val="2"/>
+        </w:numPr>
+        <w:spacing w:after="80"/>
+        <w:rPr>
+          <w:rFonts w:ascii="Baskerville" w:hAnsi="Baskerville"/>
+          <w:color w:val="000000" w:themeColor="text1"/>
+        </w:rPr>
+      </w:pPr>
+      <w:r>
+        <w:rPr>
+          <w:rFonts w:ascii="Baskerville" w:hAnsi="Baskerville"/>
+          <w:b/>
+          <w:bCs/>
+          <w:color w:val="000000" w:themeColor="text1"/>
+        </w:rPr>
+        <w:t xml:space="preserve">BA (Bon d’Achat)</w:t>
+      </w:r>
+      <w:r>
+        <w:rPr>
+          <w:rFonts w:ascii="Baskerville" w:hAnsi="Baskerville"/>
+          <w:color w:val="000000" w:themeColor="text1"/>
+        </w:rPr>
+        <w:t xml:space="preserve"> : Type orange </w:t>
+      </w:r>
+      <w:r>
+        <w:rPr>
+          <w:rFonts w:ascii="Baskerville" w:hAnsi="Baskerville"/>
+          <w:b/>
+          <w:bCs/>
+          <w:color w:val="000000" w:themeColor="text1"/>
+        </w:rPr>
+        <w:t>[BA]</w:t>
+      </w:r>
+      <w:r>
+        <w:rPr>
+          <w:rFonts w:ascii="Baskerville" w:hAnsi="Baskerville"/>
+          <w:color w:val="000000" w:themeColor="text1"/>
+        </w:rPr>
+        <w:t xml:space="preserve"> utilisé pour les achats spots ou collectes terrain (ex : Maman ABT, Kodjo Bouteille).</w:t>
+      </w:r>
+    </w:p>
+    <w:p>
+      <w:pPr>
+        <w:pStyle w:val="Titre2"/>
+        <w:rPr>
+          <w:rFonts w:ascii="Baskerville" w:hAnsi="Baskerville"/>
+          <w:color w:val="000000" w:themeColor="text1"/>
+        </w:rPr>
+      </w:pPr>
+      <w:r>
+        <w:rPr>
+          <w:rFonts w:ascii="Baskerville" w:hAnsi="Baskerville"/>
+          <w:color w:val="000000" w:themeColor="text1"/>
+        </w:rPr>
+        <w:t>2/ Réception et Entrée en Stock</w:t>
+      </w:r>
+    </w:p>
+    <w:p>
+      <w:pPr>
+        <w:pStyle w:val="Paragraphedeliste"/>
+        <w:numPr>
+          <w:ilvl w:val="0"/>
+          <w:numId w:val="2"/>
+        </w:numPr>
+        <w:spacing w:after="80"/>
+        <w:rPr>
+          <w:rFonts w:ascii="Baskerville" w:hAnsi="Baskerville"/>
+          <w:color w:val="000000" w:themeColor="text1"/>
+        </w:rPr>
+      </w:pPr>
+      <w:r>
+        <w:rPr>
+          <w:rFonts w:ascii="Baskerville" w:hAnsi="Baskerville"/>
+          <w:color w:val="000000" w:themeColor="text1"/>
+        </w:rPr>
+        <w:t xml:space="preserve">Depuis l’écran “Réception”, chaque entrée génère un numéro unique (ex : REC-2026-0009) lié au BA/BC d’origine.</w:t>
+      </w:r>
+    </w:p>
+    <w:p>
+      <w:pPr>
+        <w:pStyle w:val="Paragraphedeliste"/>
+        <w:numPr>
+          <w:ilvl w:val="0"/>
+          <w:numId w:val="2"/>
+        </w:numPr>
+        <w:spacing w:after="80"/>
+        <w:rPr>
+          <w:rFonts w:ascii="Baskerville" w:hAnsi="Baskerville"/>
+          <w:color w:val="000000" w:themeColor="text1"/>
+        </w:rPr>
+      </w:pPr>
+      <w:r>
+        <w:rPr>
+          <w:rFonts w:ascii="Baskerville" w:hAnsi="Baskerville"/>
+          <w:color w:val="000000" w:themeColor="text1"/>
+        </w:rPr>
+        <w:t xml:space="preserve">Le statut du document passe par les badges </w:t>
+      </w:r>
+      <w:r>
+        <w:rPr>
+          <w:rFonts w:ascii="Baskerville" w:hAnsi="Baskerville"/>
+          <w:b/>
+          <w:bCs/>
+          <w:color w:val="000000" w:themeColor="text1"/>
+        </w:rPr>
+        <w:t>[Brouillon]</w:t>
+      </w:r>
+      <w:r>
+        <w:rPr>
+          <w:rFonts w:ascii="Baskerville" w:hAnsi="Baskerville"/>
+          <w:color w:val="000000" w:themeColor="text1"/>
+        </w:rPr>
+        <w:t xml:space="preserve">, </w:t>
+      </w:r>
+      <w:r>
+        <w:rPr>
+          <w:rFonts w:ascii="Baskerville" w:hAnsi="Baskerville"/>
+          <w:b/>
+          <w:bCs/>
+          <w:color w:val="000000" w:themeColor="text1"/>
+        </w:rPr>
+        <w:t>[Partielle]</w:t>
+      </w:r>
+      <w:r>
+        <w:rPr>
+          <w:rFonts w:ascii="Baskerville" w:hAnsi="Baskerville"/>
+          <w:color w:val="000000" w:themeColor="text1"/>
+        </w:rPr>
+        <w:t xml:space="preserve">, ou </w:t>
+      </w:r>
+      <w:r>
+        <w:rPr>
+          <w:rFonts w:ascii="Baskerville" w:hAnsi="Baskerville"/>
+          <w:b/>
+          <w:bCs/>
+          <w:color w:val="000000" w:themeColor="text1"/>
+        </w:rPr>
+        <w:t>[Reçue]</w:t>
+      </w:r>
+      <w:r>
+        <w:rPr>
+          <w:rFonts w:ascii="Baskerville" w:hAnsi="Baskerville"/>
+          <w:color w:val="000000" w:themeColor="text1"/>
+        </w:rPr>
+        <w:t>.</w:t>
+      </w:r>
+    </w:p>
+    <w:p>
+      <w:pPr>
+        <w:pStyle w:val="Paragraphedeliste"/>
+        <w:numPr>
+          <w:ilvl w:val="0"/>
+          <w:numId w:val="2"/>
+        </w:numPr>
+        <w:spacing w:after="80"/>
+        <w:rPr>
+          <w:rFonts w:ascii="Baskerville" w:hAnsi="Baskerville"/>
+          <w:color w:val="000000" w:themeColor="text1"/>
+        </w:rPr>
+      </w:pPr>
+      <w:r>
+        <w:rPr>
+          <w:rFonts w:ascii="Baskerville" w:hAnsi="Baskerville"/>
+          <w:color w:val="000000" w:themeColor="text1"/>
+        </w:rPr>
+        <w:t xml:space="preserve">À la validation, un lot est créé. Si la Fiche Article exige un contrôle, le badge ‘Statut QC’ passe d’office à orange </w:t>
+      </w:r>
+      <w:r>
+        <w:rPr>
+          <w:rFonts w:ascii="Baskerville" w:hAnsi="Baskerville"/>
+          <w:b/>
+          <w:bCs/>
+          <w:color w:val="000000" w:themeColor="text1"/>
+        </w:rPr>
+        <w:t>[En contrôle]</w:t>
+      </w:r>
+      <w:r>
+        <w:rPr>
+          <w:rFonts w:ascii="Baskerville" w:hAnsi="Baskerville"/>
+          <w:color w:val="000000" w:themeColor="text1"/>
+        </w:rPr>
+        <w:t xml:space="preserve"> et l’état à </w:t>
+      </w:r>
+      <w:r>
+        <w:rPr>
+          <w:rFonts w:ascii="Baskerville" w:hAnsi="Baskerville"/>
+          <w:b/>
+          <w:bCs/>
+          <w:color w:val="000000" w:themeColor="text1"/>
+        </w:rPr>
+        <w:t>[Quarantaine]</w:t>
+      </w:r>
+      <w:r>
+        <w:rPr>
+          <w:rFonts w:ascii="Baskerville" w:hAnsi="Baskerville"/>
+          <w:color w:val="000000" w:themeColor="text1"/>
+        </w:rPr>
+        <w:t xml:space="preserve"> (bloqué pour la production et les ventes). Sinon, le badge passe au vert </w:t>
+      </w:r>
+      <w:r>
+        <w:rPr>
+          <w:rFonts w:ascii="Baskerville" w:hAnsi="Baskerville"/>
+          <w:b/>
+          <w:bCs/>
+          <w:color w:val="000000" w:themeColor="text1"/>
+        </w:rPr>
+        <w:t>[Disponible]</w:t>
+      </w:r>
+      <w:r>
+        <w:rPr>
+          <w:rFonts w:ascii="Baskerville" w:hAnsi="Baskerville"/>
+          <w:color w:val="000000" w:themeColor="text1"/>
+        </w:rPr>
+        <w:t>.</w:t>
+      </w:r>
+    </w:p>
+    <w:p>
+      <w:pPr>
+        <w:shd w:val="clear" w:color="auto" w:fill="FFF8E1"/>
+        <w:spacing w:before="80" w:after="160"/>
+        <w:ind w:left="280" w:right="280"/>
+        <w:rPr>
+          <w:rFonts w:ascii="Baskerville" w:hAnsi="Baskerville"/>
+          <w:i/>
+          <w:iCs/>
+          <w:color w:val="000000" w:themeColor="text1"/>
+          <w:sz w:val="20"/>
+          <w:szCs w:val="20"/>
+        </w:rPr>
+      </w:pPr>
+      <w:r>
+        <w:rPr>
+          <w:rFonts w:ascii="Baskerville" w:hAnsi="Baskerville"/>
+          <w:i/>
+          <w:iCs/>
+          <w:color w:val="000000" w:themeColor="text1"/>
+          <w:sz w:val="20"/>
+          <w:szCs w:val="20"/>
+        </w:rPr>
+        <w:t>📷  [INSÉRER CAPTURE : Statut QC En contrôle vs État Disponible]</w:t>
+      </w:r>
+    </w:p>
+    <w:p>
+      <w:pPr>
+        <w:pStyle w:val="Titre2"/>
+        <w:rPr>
+          <w:rFonts w:ascii="Baskerville" w:hAnsi="Baskerville"/>
+          <w:color w:val="000000" w:themeColor="text1"/>
+        </w:rPr>
+      </w:pPr>
+      <w:r>
+        <w:rPr>
+          <w:rFonts w:ascii="Baskerville" w:hAnsi="Baskerville"/>
+          <w:color w:val="000000" w:themeColor="text1"/>
+        </w:rPr>
+        <w:t>3/ Modules des Inventaires</w:t>
+      </w:r>
+    </w:p>
+    <w:p>
+      <w:pPr>
+        <w:pStyle w:val="Paragraphedeliste"/>
+        <w:numPr>
+          <w:ilvl w:val="0"/>
+          <w:numId w:val="2"/>
+        </w:numPr>
+        <w:spacing w:after="80"/>
+        <w:rPr>
+          <w:rFonts w:ascii="Baskerville" w:hAnsi="Baskerville"/>
+          <w:color w:val="000000" w:themeColor="text1"/>
+        </w:rPr>
+      </w:pPr>
+      <w:r>
+        <w:rPr>
+          <w:rFonts w:ascii="Baskerville" w:hAnsi="Baskerville"/>
+          <w:color w:val="000000" w:themeColor="text1"/>
+        </w:rPr>
+        <w:t>Permet de redresser le stock physique. Le document d’inventaire fige le stock théorique.</w:t>
+      </w:r>
+    </w:p>
+    <w:p>
+      <w:pPr>
+        <w:pStyle w:val="Paragraphedeliste"/>
+        <w:numPr>
+          <w:ilvl w:val="0"/>
+          <w:numId w:val="2"/>
+        </w:numPr>
+        <w:spacing w:after="80"/>
+        <w:rPr>
+          <w:rFonts w:ascii="Baskerville" w:hAnsi="Baskerville"/>
+          <w:color w:val="000000" w:themeColor="text1"/>
+        </w:rPr>
+      </w:pPr>
+      <w:r>
+        <w:rPr>
+          <w:rFonts w:ascii="Baskerville" w:hAnsi="Baskerville"/>
+          <w:color w:val="000000" w:themeColor="text1"/>
+        </w:rPr>
+        <w:t>L’opérateur saisit le réel, et l’ERP calcule et applique les écarts de quantité automatiquement après validation avec une traçabilité totale.</w:t>
+      </w:r>
+    </w:p>
+    <w:p>
+      <w:pPr>
+        <w:shd w:val="clear" w:color="auto" w:fill="FFF8E1"/>
+        <w:spacing w:before="80" w:after="280"/>
+        <w:ind w:left="280" w:right="280"/>
+        <w:rPr>
+          <w:rFonts w:ascii="Baskerville" w:hAnsi="Baskerville"/>
+          <w:i/>
+          <w:iCs/>
+          <w:color w:val="000000" w:themeColor="text1"/>
+          <w:sz w:val="20"/>
+          <w:szCs w:val="20"/>
+        </w:rPr>
+      </w:pPr>
+      <w:r>
+        <w:rPr>
+          <w:rFonts w:ascii="Baskerville" w:hAnsi="Baskerville"/>
+          <w:i/>
+          <w:iCs/>
+          <w:color w:val="000000" w:themeColor="text1"/>
+          <w:sz w:val="20"/>
+          <w:szCs w:val="20"/>
+        </w:rPr>
+        <w:t>📷  [INSÉRER CAPTURE : Écran de saisie d’un inventaire]</w:t>
       </w:r>
     </w:p>
     <w:p>

</xml_diff>